<commit_message>
fix: regenerate all 22 template.docx with proper style definitions (TNR 12pt, double-spaced, all heading/body styles)
</commit_message>
<xml_diff>
--- a/journal-templates/acs/template.docx
+++ b/journal-templates/acs/template.docx
@@ -471,7 +471,7 @@
     <w:sectPr>
       <w:footerReference w:type="default" r:id="rId9"/>
       <w:pgSz w:w="12240" w:h="15840"/>
-      <w:pgMar w:top="1440" w:right="1213" w:bottom="1440" w:left="1213" w:header="720" w:footer="720" w:gutter="0"/>
+      <w:pgMar w:top="1440" w:right="1440" w:bottom="1440" w:left="1440" w:header="720" w:footer="720" w:gutter="0"/>
       <w:lnNumType w:countBy="1" w:restart="continuous"/>
       <w:cols w:space="720"/>
       <w:docGrid w:linePitch="326"/>
@@ -971,6 +971,13 @@
     <w:name w:val="Normal"/>
     <w:qFormat/>
     <w:rsid w:val="00D51E93"/>
+    <w:pPr>
+      <w:spacing w:line="480" w:lineRule="auto" w:before="0" w:after="0"/>
+    </w:pPr>
+    <w:rPr>
+      <w:rFonts w:ascii="Times New Roman" w:hAnsi="Times New Roman"/>
+      <w:sz w:val="24"/>
+    </w:rPr>
   </w:style>
   <w:style w:type="paragraph" w:styleId="Heading1">
     <w:name w:val="heading 1"/>
@@ -983,13 +990,13 @@
     <w:pPr>
       <w:keepNext/>
       <w:keepLines/>
-      <w:spacing w:before="360" w:after="80"/>
+      <w:spacing w:before="240" w:after="120" w:line="480" w:lineRule="auto"/>
       <w:outlineLvl w:val="0"/>
     </w:pPr>
     <w:rPr>
-      <w:rFonts w:eastAsia="Times New Roman" w:cstheme="majorBidi"/>
+      <w:rFonts w:eastAsia="Times New Roman" w:cstheme="majorBidi" w:ascii="Times New Roman" w:hAnsi="Times New Roman"/>
       <w:b/>
-      <w:sz w:val="30"/>
+      <w:sz w:val="26"/>
       <w:szCs w:val="40"/>
     </w:rPr>
   </w:style>
@@ -1006,13 +1013,13 @@
     <w:pPr>
       <w:keepNext/>
       <w:keepLines/>
-      <w:spacing w:before="160" w:after="80"/>
+      <w:spacing w:before="240" w:after="120" w:line="480" w:lineRule="auto"/>
       <w:outlineLvl w:val="1"/>
     </w:pPr>
     <w:rPr>
-      <w:rFonts w:eastAsia="Times New Roman" w:cstheme="majorBidi"/>
+      <w:rFonts w:eastAsia="Times New Roman" w:cstheme="majorBidi" w:ascii="Times New Roman" w:hAnsi="Times New Roman"/>
       <w:b/>
-      <w:sz w:val="28"/>
+      <w:sz w:val="24"/>
       <w:szCs w:val="32"/>
     </w:rPr>
   </w:style>
@@ -1029,12 +1036,14 @@
     <w:pPr>
       <w:keepNext/>
       <w:keepLines/>
-      <w:spacing w:before="160" w:after="80"/>
+      <w:spacing w:before="240" w:after="120" w:line="480" w:lineRule="auto"/>
       <w:outlineLvl w:val="2"/>
     </w:pPr>
     <w:rPr>
-      <w:rFonts w:eastAsia="Times New Roman" w:cstheme="majorBidi"/>
+      <w:rFonts w:eastAsia="Times New Roman" w:cstheme="majorBidi" w:ascii="Times New Roman" w:hAnsi="Times New Roman"/>
       <w:b/>
+      <w:i/>
+      <w:sz w:val="24"/>
       <w:szCs w:val="28"/>
     </w:rPr>
   </w:style>
@@ -1197,11 +1206,12 @@
     <w:qFormat/>
     <w:rsid w:val="00DA3C75"/>
     <w:pPr>
-      <w:spacing w:before="180" w:after="180" w:line="360" w:lineRule="auto"/>
+      <w:spacing w:before="180" w:after="180" w:line="480" w:lineRule="auto"/>
       <w:jc w:val="both"/>
     </w:pPr>
     <w:rPr>
-      <w:rFonts w:eastAsia="Times New Roman"/>
+      <w:rFonts w:eastAsia="Times New Roman" w:ascii="Times New Roman" w:hAnsi="Times New Roman"/>
+      <w:sz w:val="24"/>
     </w:rPr>
   </w:style>
   <w:style w:type="paragraph" w:customStyle="1" w:styleId="FirstParagraph">
@@ -1210,6 +1220,13 @@
     <w:next w:val="BodyText"/>
     <w:qFormat/>
     <w:rsid w:val="00A1418F"/>
+    <w:pPr>
+      <w:spacing w:line="480" w:lineRule="auto"/>
+    </w:pPr>
+    <w:rPr>
+      <w:rFonts w:ascii="Times New Roman" w:hAnsi="Times New Roman"/>
+      <w:sz w:val="24"/>
+    </w:rPr>
   </w:style>
   <w:style w:type="paragraph" w:customStyle="1" w:styleId="Compact">
     <w:name w:val="Compact"/>
@@ -1217,8 +1234,12 @@
     <w:qFormat/>
     <w:rsid w:val="00D65F60"/>
     <w:pPr>
-      <w:spacing w:before="36" w:after="36"/>
-    </w:pPr>
+      <w:spacing w:before="36" w:after="36" w:line="480" w:lineRule="auto"/>
+    </w:pPr>
+    <w:rPr>
+      <w:rFonts w:ascii="Times New Roman" w:hAnsi="Times New Roman"/>
+      <w:sz w:val="24"/>
+    </w:rPr>
   </w:style>
   <w:style w:type="paragraph" w:styleId="Title">
     <w:name w:val="Title"/>
@@ -1229,10 +1250,25 @@
     <w:qFormat/>
     <w:rsid w:val="008C49E7"/>
     <w:pPr>
-      <w:spacing w:afterLines="200"/>
+      <w:spacing w:afterLines="200" w:line="480" w:lineRule="auto"/>
       <w:contextualSpacing/>
       <w:jc w:val="center"/>
     </w:pPr>
+    <w:rPr>
+      <w:rFonts w:eastAsia="Times New Roman" w:cstheme="majorBidi" w:ascii="Times New Roman" w:hAnsi="Times New Roman"/>
+      <w:b/>
+      <w:spacing w:val="-10"/>
+      <w:kern w:val="28"/>
+      <w:sz w:val="28"/>
+      <w:szCs w:val="56"/>
+    </w:rPr>
+  </w:style>
+  <w:style w:type="character" w:customStyle="1" w:styleId="TitleChar">
+    <w:name w:val="Title Char"/>
+    <w:basedOn w:val="DefaultParagraphFont"/>
+    <w:link w:val="Title"/>
+    <w:uiPriority w:val="10"/>
+    <w:rsid w:val="008C49E7"/>
     <w:rPr>
       <w:rFonts w:eastAsia="Times New Roman" w:cstheme="majorBidi"/>
       <w:b/>
@@ -1242,21 +1278,6 @@
       <w:szCs w:val="56"/>
     </w:rPr>
   </w:style>
-  <w:style w:type="character" w:customStyle="1" w:styleId="TitleChar">
-    <w:name w:val="Title Char"/>
-    <w:basedOn w:val="DefaultParagraphFont"/>
-    <w:link w:val="Title"/>
-    <w:uiPriority w:val="10"/>
-    <w:rsid w:val="008C49E7"/>
-    <w:rPr>
-      <w:rFonts w:eastAsia="Times New Roman" w:cstheme="majorBidi"/>
-      <w:b/>
-      <w:spacing w:val="-10"/>
-      <w:kern w:val="28"/>
-      <w:sz w:val="32"/>
-      <w:szCs w:val="56"/>
-    </w:rPr>
-  </w:style>
   <w:style w:type="paragraph" w:styleId="Subtitle">
     <w:name w:val="Subtitle"/>
     <w:basedOn w:val="Title"/>
@@ -1269,10 +1290,12 @@
       <w:numPr>
         <w:ilvl w:val="1"/>
       </w:numPr>
-    </w:pPr>
-    <w:rPr>
+      <w:spacing w:line="480" w:lineRule="auto"/>
+    </w:pPr>
+    <w:rPr>
+      <w:rFonts w:ascii="Times New Roman" w:hAnsi="Times New Roman"/>
       <w:spacing w:val="15"/>
-      <w:sz w:val="28"/>
+      <w:sz w:val="24"/>
       <w:szCs w:val="28"/>
     </w:rPr>
   </w:style>
@@ -1298,10 +1321,12 @@
     <w:pPr>
       <w:keepNext/>
       <w:keepLines/>
+      <w:spacing w:line="480" w:lineRule="auto"/>
       <w:jc w:val="center"/>
     </w:pPr>
     <w:rPr>
-      <w:rFonts w:eastAsia="Times New Roman"/>
+      <w:rFonts w:eastAsia="Times New Roman" w:ascii="Times New Roman" w:hAnsi="Times New Roman"/>
+      <w:sz w:val="24"/>
     </w:rPr>
   </w:style>
   <w:style w:type="paragraph" w:styleId="Date">
@@ -1312,10 +1337,12 @@
     <w:pPr>
       <w:keepNext/>
       <w:keepLines/>
+      <w:spacing w:line="480" w:lineRule="auto"/>
       <w:jc w:val="center"/>
     </w:pPr>
     <w:rPr>
-      <w:rFonts w:eastAsia="Times New Roman"/>
+      <w:rFonts w:eastAsia="Times New Roman" w:ascii="Times New Roman" w:hAnsi="Times New Roman"/>
+      <w:sz w:val="24"/>
     </w:rPr>
   </w:style>
   <w:style w:type="paragraph" w:customStyle="1" w:styleId="AbstractTitle">
@@ -1327,12 +1354,13 @@
     <w:pPr>
       <w:keepNext/>
       <w:keepLines/>
-      <w:spacing w:before="300" w:after="0"/>
+      <w:spacing w:before="300" w:after="0" w:line="480" w:lineRule="auto"/>
       <w:jc w:val="center"/>
     </w:pPr>
     <w:rPr>
-      <w:rFonts w:eastAsia="Times New Roman"/>
+      <w:rFonts w:eastAsia="Times New Roman" w:ascii="Times New Roman" w:hAnsi="Times New Roman"/>
       <w:b/>
+      <w:sz w:val="24"/>
       <w:szCs w:val="20"/>
     </w:rPr>
   </w:style>
@@ -1345,10 +1373,11 @@
     <w:pPr>
       <w:keepNext/>
       <w:keepLines/>
-      <w:spacing w:before="100" w:after="300"/>
-    </w:pPr>
-    <w:rPr>
-      <w:rFonts w:eastAsia="Times New Roman"/>
+      <w:spacing w:before="100" w:after="300" w:line="480" w:lineRule="auto"/>
+    </w:pPr>
+    <w:rPr>
+      <w:rFonts w:eastAsia="Times New Roman" w:ascii="Times New Roman" w:hAnsi="Times New Roman"/>
+      <w:sz w:val="24"/>
       <w:szCs w:val="20"/>
     </w:rPr>
   </w:style>
@@ -1357,8 +1386,12 @@
     <w:basedOn w:val="Normal"/>
     <w:qFormat/>
     <w:rsid w:val="001F46A3"/>
-    <w:rPr>
-      <w:rFonts w:eastAsia="Times New Roman"/>
+    <w:pPr>
+      <w:spacing w:line="480" w:lineRule="auto"/>
+    </w:pPr>
+    <w:rPr>
+      <w:rFonts w:eastAsia="Times New Roman" w:ascii="Times New Roman" w:hAnsi="Times New Roman"/>
+      <w:sz w:val="24"/>
     </w:rPr>
   </w:style>
   <w:style w:type="character" w:customStyle="1" w:styleId="Heading1Char">
@@ -1564,10 +1597,12 @@
     <w:basedOn w:val="Normal"/>
     <w:link w:val="CaptionChar"/>
     <w:pPr>
-      <w:spacing w:after="120"/>
-    </w:pPr>
-    <w:rPr>
+      <w:spacing w:after="120" w:line="360" w:lineRule="auto"/>
+    </w:pPr>
+    <w:rPr>
+      <w:rFonts w:ascii="Times New Roman" w:hAnsi="Times New Roman"/>
       <w:i/>
+      <w:sz w:val="20"/>
     </w:rPr>
   </w:style>
   <w:style w:type="paragraph" w:customStyle="1" w:styleId="TableCaption">

</xml_diff>